<commit_message>
Finished 'LateSubmissionOfDec' merge. Created extension of time UI.
</commit_message>
<xml_diff>
--- a/project/documents/transmittal/LateSubmissionOfDec.docx
+++ b/project/documents/transmittal/LateSubmissionOfDec.docx
@@ -429,13 +429,13 @@
         <w:rPr>
           <w:sz w:val="24"/>
         </w:rPr>
-        <w:t xml:space="preserve">the Signed </w:t>
-      </w:r>
-      <w:r>
-        <w:rPr>
-          <w:sz w:val="24"/>
-        </w:rPr>
-        <w:t>Declaration</w:t>
+        <w:t>the Signed</w:t>
+      </w:r>
+      <w:r>
+        <w:rPr>
+          <w:sz w:val="24"/>
+        </w:rPr>
+        <w:t xml:space="preserve"> </w:t>
       </w:r>
       <w:r>
         <w:rPr>
@@ -1188,13 +1188,20 @@
           <w:sz w:val="24"/>
           <w:u w:val="single"/>
         </w:rPr>
-        <w:t>&lt;&lt;sub</w:t>
+        <w:t>&lt;&lt;</w:t>
       </w:r>
       <w:r>
         <w:rPr>
           <w:sz w:val="24"/>
           <w:u w:val="single"/>
         </w:rPr>
+        <w:t>dep</w:t>
+      </w:r>
+      <w:r>
+        <w:rPr>
+          <w:sz w:val="24"/>
+          <w:u w:val="single"/>
+        </w:rPr>
         <w:t>X</w:t>
       </w:r>
       <w:r>
@@ -1213,7 +1220,19 @@
         <w:rPr>
           <w:sz w:val="24"/>
         </w:rPr>
-        <w:t>&lt;&lt;subT</w:t>
+        <w:t>&lt;&lt;</w:t>
+      </w:r>
+      <w:r>
+        <w:rPr>
+          <w:sz w:val="24"/>
+        </w:rPr>
+        <w:t>dep</w:t>
+      </w:r>
+      <w:r>
+        <w:rPr>
+          <w:sz w:val="24"/>
+        </w:rPr>
+        <w:t>T</w:t>
       </w:r>
       <w:r>
         <w:rPr>
@@ -1238,29 +1257,65 @@
           <w:sz w:val="24"/>
           <w:u w:val="single"/>
         </w:rPr>
-        <w:t>X</w:t>
+        <w:t>&lt;&lt;dec</w:t>
       </w:r>
       <w:r>
         <w:rPr>
           <w:noProof/>
           <w:sz w:val="24"/>
-        </w:rPr>
-        <w:tab/>
-        <w:t>Signed Declaration (</w:t>
+          <w:u w:val="single"/>
+        </w:rPr>
+        <w:t>sub</w:t>
       </w:r>
       <w:r>
         <w:rPr>
           <w:noProof/>
           <w:sz w:val="24"/>
-        </w:rPr>
-        <w:t>&lt;&lt;pgs&gt;&gt;</w:t>
+          <w:u w:val="single"/>
+        </w:rPr>
+        <w:t>X&gt;&gt;</w:t>
       </w:r>
       <w:r>
         <w:rPr>
           <w:noProof/>
           <w:sz w:val="24"/>
         </w:rPr>
-        <w:t>).</w:t>
+        <w:tab/>
+      </w:r>
+      <w:r>
+        <w:rPr>
+          <w:noProof/>
+          <w:sz w:val="24"/>
+        </w:rPr>
+        <w:t>&lt;&lt;</w:t>
+      </w:r>
+      <w:r>
+        <w:rPr>
+          <w:noProof/>
+          <w:sz w:val="24"/>
+        </w:rPr>
+        <w:t>dec</w:t>
+      </w:r>
+      <w:r>
+        <w:rPr>
+          <w:noProof/>
+          <w:sz w:val="24"/>
+        </w:rPr>
+        <w:t>sub</w:t>
+      </w:r>
+      <w:r>
+        <w:rPr>
+          <w:noProof/>
+          <w:sz w:val="24"/>
+        </w:rPr>
+        <w:t>Text</w:t>
+      </w:r>
+      <w:r>
+        <w:rPr>
+          <w:noProof/>
+          <w:sz w:val="24"/>
+        </w:rPr>
+        <w:t>&gt;&gt;</w:t>
       </w:r>
     </w:p>
     <w:p>

</xml_diff>